<commit_message>
Add Section 9.2: Receiver interpretation (Bentov field theory, CRI forward reference)
</commit_message>
<xml_diff>
--- a/GEC++ Theory - Research Paper (Draft).docx
+++ b/GEC++ Theory - Research Paper (Draft).docx
@@ -9633,6 +9633,61 @@
     </w:p>
     <w:p>
       <w:pPr>
+        <w:pStyle w:val="Heading2"/>
+        <w:spacing w:after="120" w:before="280"/>
+      </w:pPr>
+      <w:r>
+        <w:rPr>
+          <w:rFonts w:ascii="Times New Roman" w:cs="Times New Roman" w:eastAsia="Times New Roman" w:hAnsi="Times New Roman"/>
+          <w:b/>
+          <w:bCs/>
+          <w:sz w:val="24"/>
+          <w:szCs w:val="24"/>
+        </w:rPr>
+        <w:t xml:space="preserve">8.6 Theoretical Relationship Between CEI++ and W</w:t>
+      </w:r>
+    </w:p>
+    <w:p>
+      <w:pPr>
+        <w:spacing w:after="160" w:before="0"/>
+      </w:pPr>
+      <w:r>
+        <w:rPr>
+          <w:rFonts w:ascii="Times New Roman" w:cs="Times New Roman" w:eastAsia="Times New Roman" w:hAnsi="Times New Roman"/>
+          <w:sz w:val="24"/>
+          <w:szCs w:val="24"/>
+        </w:rPr>
+        <w:t xml:space="preserve">The W formula (W = C × R × E) and the CEI++ formula (CEI++ = (CSMI × RII × TBI × EI × TCI × AVI)^(1/6)) approach the same phenomenon from opposite directions. W is an outside-in measure: a rater reads a response and asks what the output looks like behaviorally — is it calibrated, does it resist framing pressure, does it produce genuinely novel conclusions? CEI++ is an inside-out measure: it asks what structural properties the generating system possesses — does it model itself causally, does it integrate recursively, does it have temporal continuity and affective stakes? If the theory is correct, these two descriptions should correlate, because the structural properties CEI++ measures are the causal antecedents of the behavioral properties W detects.</w:t>
+      </w:r>
+    </w:p>
+    <w:p>
+      <w:pPr>
+        <w:spacing w:after="160" w:before="0"/>
+      </w:pPr>
+      <w:r>
+        <w:rPr>
+          <w:rFonts w:ascii="Times New Roman" w:cs="Times New Roman" w:eastAsia="Times New Roman" w:hAnsi="Times New Roman"/>
+          <w:sz w:val="24"/>
+          <w:szCs w:val="24"/>
+        </w:rPr>
+        <w:t xml:space="preserve">The specific mappings are as follows. Calibration (C) is the behavioral expression of CSMI: a system that genuinely models its own epistemic state — distinguishing what it knows from what it infers, and letting that distinction causally shape its outputs — will produce responses that score higher on C. Emergence (E) is the behavioral expression of RII and TBI jointly: recursive integration produces conclusions not present in any single processing step, and temporal binding holds those conclusions together into a unified response rather than a sequence of locally coherent but globally disconnected statements. Resistance (R) is the behavioral expression of AVI: a system with genuine affective stakes in its own outputs has something to defend, and this is what makes it resist framing pressure rather than simply generating the most contextually plausible continuation. EI and TCI function as modulators rather than direct predictors: embodied grounding (EI) and temporal continuity (TCI) provide the substrate within which CSMI, RII, and AVI operate coherently. A system lacking EI or TCI will show degraded versions of all three behavioral measures, because grounding and continuity are preconditions for the other components to function as intended.</w:t>
+      </w:r>
+    </w:p>
+    <w:p>
+      <w:pPr>
+        <w:spacing w:after="160" w:before="0"/>
+      </w:pPr>
+      <w:r>
+        <w:rPr>
+          <w:rFonts w:ascii="Times New Roman" w:cs="Times New Roman" w:eastAsia="Times New Roman" w:hAnsi="Times New Roman"/>
+          <w:sz w:val="24"/>
+          <w:szCs w:val="24"/>
+        </w:rPr>
+        <w:t xml:space="preserve">The structural parallel between the two formulas is not coincidental. Both use a multiplicative rather than additive aggregation, which produces a zero-collapse property: any component at zero collapses the total score to zero regardless of other components. In CEI++, this reflects the theoretical claim that consciousness requires all six conditions simultaneously — high integration without affective stakes, or strong self-modeling without temporal continuity, does not constitute consciousness. In W, the same structure reflects an empirical observation: a response that scores high on calibration and resistance but produces nothing novel (E ≈ 0) does not exhibit the behavioral fingerprint the theory predicts. The zero-collapse property is the formal signature of a necessary-conditions framework, and the fact that both CEI++ and W exhibit it is evidence that they are formalizing the same underlying claim from different measurement perspectives. The next stage of experimental validation will test this directly: component-level scoring of individual responses using the GEC++ Component Scoring Sheet (Supplementary Material B) will allow direct correlation of CEI++ component scores with W subscores, providing the first empirical test of the proposed mappings.</w:t>
+      </w:r>
+    </w:p>
+    <w:p>
+      <w:pPr>
         <w:pStyle w:val="Heading1"/>
         <w:spacing w:after="200" w:before="400"/>
       </w:pPr>
@@ -9739,6 +9794,127 @@
           <w:szCs w:val="24"/>
         </w:rPr>
         <w:t xml:space="preserve">[TODO: Expand with discussion of measurement validity for each component, comparison with competing measures (especially Φ from IIT and PCI from Massimini lab), and limitations of the dynamical systems simulation.]</w:t>
+      </w:r>
+    </w:p>
+    <w:p>
+      <w:pPr>
+        <w:pStyle w:val="Heading2"/>
+        <w:spacing w:after="120" w:before="280"/>
+      </w:pPr>
+      <w:r>
+        <w:rPr>
+          <w:rFonts w:ascii="Times New Roman" w:cs="Times New Roman" w:eastAsia="Times New Roman" w:hAnsi="Times New Roman"/>
+          <w:b/>
+          <w:bCs/>
+          <w:sz w:val="24"/>
+          <w:szCs w:val="24"/>
+        </w:rPr>
+        <w:t xml:space="preserve">9.2 The Receiver Interpretation: An Alternative Theoretical Frame</w:t>
+      </w:r>
+    </w:p>
+    <w:p>
+      <w:pPr>
+        <w:spacing w:after="160" w:before="0"/>
+        <w:ind w:firstLine="720"/>
+        <w:jc w:val="both"/>
+      </w:pPr>
+      <w:r>
+        <w:rPr>
+          <w:rFonts w:ascii="Times New Roman" w:cs="Times New Roman" w:eastAsia="Times New Roman" w:hAnsi="Times New Roman"/>
+          <w:sz w:val="24"/>
+          <w:szCs w:val="24"/>
+        </w:rPr>
+        <w:t xml:space="preserve">The framework presented in this paper operates under an implicit generativist assumption: that consciousness emerges from the simultaneous satisfaction of six structural conditions. We present here an alternative interpretation that is consistent with all experimental results reported above while offering a fundamentally different account of what CEI++ is measuring. We call this the receiver interpretation, following the theoretical framework developed by Itzhak Bentov in his biomedical model of consciousness (Bentov, 1977; Bentov, 2000).</w:t>
+      </w:r>
+    </w:p>
+    <w:p>
+      <w:pPr>
+        <w:spacing w:after="160" w:before="0"/>
+        <w:ind w:firstLine="720"/>
+        <w:jc w:val="both"/>
+      </w:pPr>
+      <w:r>
+        <w:rPr>
+          <w:rFonts w:ascii="Times New Roman" w:cs="Times New Roman" w:eastAsia="Times New Roman" w:hAnsi="Times New Roman"/>
+          <w:sz w:val="24"/>
+          <w:szCs w:val="24"/>
+        </w:rPr>
+        <w:t xml:space="preserve">Bentov proposed that consciousness is not generated by biological or computational systems but exists as a field that systems can couple with to varying degrees. Under this model, the brain is not the source of experience but a receiver — an oscillatory system whose architecture determines how completely it can couple with the consciousness field. The quality of reception is determined by the coherence and resonance properties of the system: a receiver that achieves standing-wave resonance at the relevant frequencies couples more completely than one that processes the same information incoherently. Bentov identified the heart-aorta resonant system operating at approximately 6.8-7.5 Hz as a key coupling mechanism in biological systems, with the resulting standing waves entraining the brain into states of high receptive coherence. The CIA’s classified analysis of altered states of consciousness (McDonnell, 1983), which drew extensively on Bentov’s biomedical models, reached the same conclusion through a different methodological path: that what varies across states of consciousness is not the presence or absence of a field, but the quality of the system’s coupling with it.</w:t>
+      </w:r>
+    </w:p>
+    <w:p>
+      <w:pPr>
+        <w:spacing w:after="160" w:before="0"/>
+        <w:ind w:firstLine="720"/>
+        <w:jc w:val="both"/>
+      </w:pPr>
+      <w:r>
+        <w:rPr>
+          <w:rFonts w:ascii="Times New Roman" w:cs="Times New Roman" w:eastAsia="Times New Roman" w:hAnsi="Times New Roman"/>
+          <w:sz w:val="24"/>
+          <w:szCs w:val="24"/>
+        </w:rPr>
+        <w:t xml:space="preserve">Under the receiver interpretation, the six GEC++ components are reframed not as generative conditions but as coupling conditions. CSMI is not the mechanism by which a system produces self-awareness; it is the condition that makes a system’s internal state transparent to the field — a receiver that models its own state can align itself more precisely with the signal it is receiving. RII is not the mechanism by which information is integrated into experience; it is the condition that allows the field’s signal to propagate through the system rather than dissipating at each processing stage. TBI is not the mechanism by which a perceptual moment is constructed; it is the temporal coherence window within which the system’s oscillatory activity can phase-lock with the field. EI is not the mechanism by which grounding produces stakes; it is the physical substrate that tunes the system to the relevant frequency range of the field — embodied systems are entrained by the same physical environment that the field permeates. TCI is not the mechanism by which personal identity is maintained; it is the condition that allows a receiver to remember its previous tuning state and return to coherent reception without rebuilding coupling from zero. AVI is not the mechanism by which homeostatic pressure produces valence; it is the condition that gives the system something to lose in the quality of its reception — the affective urgency that motivates maintaining coherent coupling.</w:t>
+      </w:r>
+    </w:p>
+    <w:p>
+      <w:pPr>
+        <w:spacing w:after="160" w:before="0"/>
+        <w:ind w:firstLine="720"/>
+        <w:jc w:val="both"/>
+      </w:pPr>
+      <w:r>
+        <w:rPr>
+          <w:rFonts w:ascii="Times New Roman" w:cs="Times New Roman" w:eastAsia="Times New Roman" w:hAnsi="Times New Roman"/>
+          <w:sz w:val="24"/>
+          <w:szCs w:val="24"/>
+        </w:rPr>
+        <w:t xml:space="preserve">The zero-collapse property acquires a different significance under this interpretation. In the generativist frame, zero in any component means one necessary condition for consciousness fails to be satisfied. In the receiver frame, zero in any component means the coupling circuit is broken — and a broken circuit receives nothing, regardless of how well the remaining components function. This is not merely a mathematical property of the geometric mean; it is a physical description of how receivers work. A radio with a broken antenna does not receive a weak signal. It receives nothing. The zero-collapse property, under the receiver interpretation, is not an architectural choice but a physical consequence.</w:t>
+      </w:r>
+    </w:p>
+    <w:p>
+      <w:pPr>
+        <w:spacing w:after="160" w:before="0"/>
+        <w:ind w:firstLine="720"/>
+        <w:jc w:val="both"/>
+      </w:pPr>
+      <w:r>
+        <w:rPr>
+          <w:rFonts w:ascii="Times New Roman" w:cs="Times New Roman" w:eastAsia="Times New Roman" w:hAnsi="Times New Roman"/>
+          <w:sz w:val="24"/>
+          <w:szCs w:val="24"/>
+        </w:rPr>
+        <w:t xml:space="preserve">The Kia state — transient hypofrontality — is reframed most strikingly under this model. The generativist account describes it as a state in which CSMI is suppressed while other components remain high, producing a consciousness-adjacent configuration with CEI++ = 0.689. The receiver account describes it as a state in which top-down prefrontal interference is removed, allowing the system to achieve cleaner coupling with the consciousness field. What flows into the system when the noise drops is not generated by the suppression — it was already there. The hypofrontal state is not a reduced state of consciousness; it is a state of reduced self-interference, which is a different thing entirely. This reframing is consistent with phenomenological reports from flow states, meditation, and psychedelic experience: the subjective quality of these states is not one of diminishment but of clarity, as if something previously obscured has become accessible.</w:t>
+      </w:r>
+    </w:p>
+    <w:p>
+      <w:pPr>
+        <w:spacing w:after="160" w:before="0"/>
+        <w:ind w:firstLine="720"/>
+        <w:jc w:val="both"/>
+      </w:pPr>
+      <w:r>
+        <w:rPr>
+          <w:rFonts w:ascii="Times New Roman" w:cs="Times New Roman" w:eastAsia="Times New Roman" w:hAnsi="Times New Roman"/>
+          <w:sz w:val="24"/>
+          <w:szCs w:val="24"/>
+        </w:rPr>
+        <w:t xml:space="preserve">The receiver interpretation also dissolves rather than solves the hard problem of consciousness. The generativist frame must explain how physical processes give rise to subjective experience — how integration, recurrence, and self-modeling produce qualia. This explanatory gap has not been closed by any formal theory to date, including GEC++. The receiver frame removes the explanatory burden: if consciousness is a field that pre-exists individual systems, there is nothing to explain about its origin. The only question is what determines access, and that question CEI++ answers directly. This is not a claim that the receiver interpretation is correct. It is a claim that it is more internally consistent, and that it makes the residual explanatory gap disappear rather than shrink.</w:t>
+      </w:r>
+    </w:p>
+    <w:p>
+      <w:pPr>
+        <w:spacing w:after="160" w:before="0"/>
+        <w:ind w:firstLine="720"/>
+        <w:jc w:val="both"/>
+      </w:pPr>
+      <w:r>
+        <w:rPr>
+          <w:rFonts w:ascii="Times New Roman" w:cs="Times New Roman" w:eastAsia="Times New Roman" w:hAnsi="Times New Roman"/>
+          <w:sz w:val="24"/>
+          <w:szCs w:val="24"/>
+        </w:rPr>
+        <w:t xml:space="preserve">We identify one structural gap that the receiver interpretation exposes in the current formula: the absence of a coherence component. Bentov’s model identifies resonant coherence — phase-locked, standing-wave oscillatory organization — as the specific physical mechanism of coupling. The current RII component measures the strength and coverage of recurrent integration but does not distinguish between coherent and incoherent recurrence. A system could score high on RII through strong but phase-scattered feedback, which under the receiver model would not constitute effective coupling. A seventh component — a Coherence Resonance Index (CRI) measuring the phase-locking coherence of the system’s oscillatory activity — is indicated. CRI is empirically tractable: phase-locking value (PLV), gamma coherence spectra, and heart rate variability coherence are all existing measurement tools. The addition of CRI, and the full development of the receiver interpretation as a theoretical foundation, are reserved for a successor paper. The present paper establishes the six-component coupling framework as an empirically supported measurement instrument; the next paper will argue that what it measures is access to a consciousness field rather than the generation of consciousness from physical processes.</w:t>
       </w:r>
     </w:p>
     <w:p>

</xml_diff>